<commit_message>
Calling Player 100K finished
</commit_message>
<xml_diff>
--- a/Отчёты/Отчёт по практике.docx
+++ b/Отчёты/Отчёт по практике.docx
@@ -526,7 +526,7 @@
           <w:bCs/>
         </w:rPr>
       </w:pPr>
-      <w:bookmarkStart w:id="0" w:name="_Toc227613245"/>
+      <w:bookmarkStart w:id="0" w:name="_Toc227663055"/>
       <w:r>
         <w:rPr>
           <w:rFonts w:cs="Times New Roman"/>
@@ -601,7 +601,7 @@
           <w:r>
             <w:fldChar w:fldCharType="separate"/>
           </w:r>
-          <w:hyperlink w:anchor="_Toc227613245" w:history="1">
+          <w:hyperlink w:anchor="_Toc227663055" w:history="1">
             <w:r>
               <w:rPr>
                 <w:rStyle w:val="ab"/>
@@ -630,7 +630,7 @@
                 <w:noProof/>
                 <w:webHidden/>
               </w:rPr>
-              <w:instrText xml:space="preserve"> PAGEREF _Toc227613245 \h </w:instrText>
+              <w:instrText xml:space="preserve"> PAGEREF _Toc227663055 \h </w:instrText>
             </w:r>
             <w:r>
               <w:rPr>
@@ -674,7 +674,7 @@
               <w:szCs w:val="22"/>
             </w:rPr>
           </w:pPr>
-          <w:hyperlink w:anchor="_Toc227613246" w:history="1">
+          <w:hyperlink w:anchor="_Toc227663056" w:history="1">
             <w:r>
               <w:rPr>
                 <w:rStyle w:val="ab"/>
@@ -702,7 +702,7 @@
                 <w:noProof/>
                 <w:webHidden/>
               </w:rPr>
-              <w:instrText xml:space="preserve"> PAGEREF _Toc227613246 \h </w:instrText>
+              <w:instrText xml:space="preserve"> PAGEREF _Toc227663056 \h </w:instrText>
             </w:r>
             <w:r>
               <w:rPr>
@@ -746,7 +746,7 @@
               <w:szCs w:val="22"/>
             </w:rPr>
           </w:pPr>
-          <w:hyperlink w:anchor="_Toc227613247" w:history="1">
+          <w:hyperlink w:anchor="_Toc227663057" w:history="1">
             <w:r>
               <w:rPr>
                 <w:rStyle w:val="ab"/>
@@ -806,7 +806,7 @@
                 <w:noProof/>
                 <w:webHidden/>
               </w:rPr>
-              <w:instrText xml:space="preserve"> PAGEREF _Toc227613247 \h </w:instrText>
+              <w:instrText xml:space="preserve"> PAGEREF _Toc227663057 \h </w:instrText>
             </w:r>
             <w:r>
               <w:rPr>
@@ -850,7 +850,7 @@
               <w:szCs w:val="22"/>
             </w:rPr>
           </w:pPr>
-          <w:hyperlink w:anchor="_Toc227613248" w:history="1">
+          <w:hyperlink w:anchor="_Toc227663058" w:history="1">
             <w:r>
               <w:rPr>
                 <w:rStyle w:val="ab"/>
@@ -878,7 +878,7 @@
                 <w:noProof/>
                 <w:webHidden/>
               </w:rPr>
-              <w:instrText xml:space="preserve"> PAGEREF _Toc227613248 \h </w:instrText>
+              <w:instrText xml:space="preserve"> PAGEREF _Toc227663058 \h </w:instrText>
             </w:r>
             <w:r>
               <w:rPr>
@@ -922,7 +922,7 @@
               <w:szCs w:val="22"/>
             </w:rPr>
           </w:pPr>
-          <w:hyperlink w:anchor="_Toc227613249" w:history="1">
+          <w:hyperlink w:anchor="_Toc227663059" w:history="1">
             <w:r>
               <w:rPr>
                 <w:rStyle w:val="ab"/>
@@ -950,7 +950,7 @@
                 <w:noProof/>
                 <w:webHidden/>
               </w:rPr>
-              <w:instrText xml:space="preserve"> PAGEREF _Toc227613249 \h </w:instrText>
+              <w:instrText xml:space="preserve"> PAGEREF _Toc227663059 \h </w:instrText>
             </w:r>
             <w:r>
               <w:rPr>
@@ -994,7 +994,7 @@
               <w:szCs w:val="22"/>
             </w:rPr>
           </w:pPr>
-          <w:hyperlink w:anchor="_Toc227613250" w:history="1">
+          <w:hyperlink w:anchor="_Toc227663060" w:history="1">
             <w:r>
               <w:rPr>
                 <w:rStyle w:val="ab"/>
@@ -1022,7 +1022,7 @@
                 <w:noProof/>
                 <w:webHidden/>
               </w:rPr>
-              <w:instrText xml:space="preserve"> PAGEREF _Toc227613250 \h </w:instrText>
+              <w:instrText xml:space="preserve"> PAGEREF _Toc227663060 \h </w:instrText>
             </w:r>
             <w:r>
               <w:rPr>
@@ -1066,7 +1066,7 @@
               <w:szCs w:val="22"/>
             </w:rPr>
           </w:pPr>
-          <w:hyperlink w:anchor="_Toc227613251" w:history="1">
+          <w:hyperlink w:anchor="_Toc227663061" w:history="1">
             <w:r>
               <w:rPr>
                 <w:rStyle w:val="ab"/>
@@ -1094,7 +1094,7 @@
                 <w:noProof/>
                 <w:webHidden/>
               </w:rPr>
-              <w:instrText xml:space="preserve"> PAGEREF _Toc227613251 \h </w:instrText>
+              <w:instrText xml:space="preserve"> PAGEREF _Toc227663061 \h </w:instrText>
             </w:r>
             <w:r>
               <w:rPr>
@@ -1138,7 +1138,7 @@
               <w:szCs w:val="22"/>
             </w:rPr>
           </w:pPr>
-          <w:hyperlink w:anchor="_Toc227613252" w:history="1">
+          <w:hyperlink w:anchor="_Toc227663062" w:history="1">
             <w:r>
               <w:rPr>
                 <w:rStyle w:val="ab"/>
@@ -1166,7 +1166,7 @@
                 <w:noProof/>
                 <w:webHidden/>
               </w:rPr>
-              <w:instrText xml:space="preserve"> PAGEREF _Toc227613252 \h </w:instrText>
+              <w:instrText xml:space="preserve"> PAGEREF _Toc227663062 \h </w:instrText>
             </w:r>
             <w:r>
               <w:rPr>
@@ -1210,7 +1210,7 @@
               <w:szCs w:val="22"/>
             </w:rPr>
           </w:pPr>
-          <w:hyperlink w:anchor="_Toc227613253" w:history="1">
+          <w:hyperlink w:anchor="_Toc227663063" w:history="1">
             <w:r>
               <w:rPr>
                 <w:rStyle w:val="ab"/>
@@ -1238,7 +1238,7 @@
                 <w:noProof/>
                 <w:webHidden/>
               </w:rPr>
-              <w:instrText xml:space="preserve"> PAGEREF _Toc227613253 \h </w:instrText>
+              <w:instrText xml:space="preserve"> PAGEREF _Toc227663063 \h </w:instrText>
             </w:r>
             <w:r>
               <w:rPr>
@@ -1282,7 +1282,7 @@
               <w:szCs w:val="22"/>
             </w:rPr>
           </w:pPr>
-          <w:hyperlink w:anchor="_Toc227613254" w:history="1">
+          <w:hyperlink w:anchor="_Toc227663064" w:history="1">
             <w:r>
               <w:rPr>
                 <w:rStyle w:val="ab"/>
@@ -1310,7 +1310,7 @@
                 <w:noProof/>
                 <w:webHidden/>
               </w:rPr>
-              <w:instrText xml:space="preserve"> PAGEREF _Toc227613254 \h </w:instrText>
+              <w:instrText xml:space="preserve"> PAGEREF _Toc227663064 \h </w:instrText>
             </w:r>
             <w:r>
               <w:rPr>
@@ -1354,7 +1354,7 @@
               <w:szCs w:val="22"/>
             </w:rPr>
           </w:pPr>
-          <w:hyperlink w:anchor="_Toc227613255" w:history="1">
+          <w:hyperlink w:anchor="_Toc227663065" w:history="1">
             <w:r>
               <w:rPr>
                 <w:rStyle w:val="ab"/>
@@ -1382,7 +1382,7 @@
                 <w:noProof/>
                 <w:webHidden/>
               </w:rPr>
-              <w:instrText xml:space="preserve"> PAGEREF _Toc227613255 \h </w:instrText>
+              <w:instrText xml:space="preserve"> PAGEREF _Toc227663065 \h </w:instrText>
             </w:r>
             <w:r>
               <w:rPr>
@@ -1426,7 +1426,7 @@
               <w:szCs w:val="22"/>
             </w:rPr>
           </w:pPr>
-          <w:hyperlink w:anchor="_Toc227613256" w:history="1">
+          <w:hyperlink w:anchor="_Toc227663066" w:history="1">
             <w:r>
               <w:rPr>
                 <w:rStyle w:val="ab"/>
@@ -1454,7 +1454,7 @@
                 <w:noProof/>
                 <w:webHidden/>
               </w:rPr>
-              <w:instrText xml:space="preserve"> PAGEREF _Toc227613256 \h </w:instrText>
+              <w:instrText xml:space="preserve"> PAGEREF _Toc227663066 \h </w:instrText>
             </w:r>
             <w:r>
               <w:rPr>
@@ -1498,7 +1498,7 @@
               <w:szCs w:val="22"/>
             </w:rPr>
           </w:pPr>
-          <w:hyperlink w:anchor="_Toc227613257" w:history="1">
+          <w:hyperlink w:anchor="_Toc227663067" w:history="1">
             <w:r>
               <w:rPr>
                 <w:rStyle w:val="ab"/>
@@ -1526,7 +1526,7 @@
                 <w:noProof/>
                 <w:webHidden/>
               </w:rPr>
-              <w:instrText xml:space="preserve"> PAGEREF _Toc227613257 \h </w:instrText>
+              <w:instrText xml:space="preserve"> PAGEREF _Toc227663067 \h </w:instrText>
             </w:r>
             <w:r>
               <w:rPr>
@@ -1570,7 +1570,7 @@
               <w:szCs w:val="22"/>
             </w:rPr>
           </w:pPr>
-          <w:hyperlink w:anchor="_Toc227613258" w:history="1">
+          <w:hyperlink w:anchor="_Toc227663068" w:history="1">
             <w:r>
               <w:rPr>
                 <w:rStyle w:val="ab"/>
@@ -1598,7 +1598,7 @@
                 <w:noProof/>
                 <w:webHidden/>
               </w:rPr>
-              <w:instrText xml:space="preserve"> PAGEREF _Toc227613258 \h </w:instrText>
+              <w:instrText xml:space="preserve"> PAGEREF _Toc227663068 \h </w:instrText>
             </w:r>
             <w:r>
               <w:rPr>
@@ -1642,7 +1642,7 @@
               <w:szCs w:val="22"/>
             </w:rPr>
           </w:pPr>
-          <w:hyperlink w:anchor="_Toc227613259" w:history="1">
+          <w:hyperlink w:anchor="_Toc227663069" w:history="1">
             <w:r>
               <w:rPr>
                 <w:rStyle w:val="ab"/>
@@ -1670,7 +1670,7 @@
                 <w:noProof/>
                 <w:webHidden/>
               </w:rPr>
-              <w:instrText xml:space="preserve"> PAGEREF _Toc227613259 \h </w:instrText>
+              <w:instrText xml:space="preserve"> PAGEREF _Toc227663069 \h </w:instrText>
             </w:r>
             <w:r>
               <w:rPr>
@@ -1714,14 +1714,14 @@
               <w:szCs w:val="22"/>
             </w:rPr>
           </w:pPr>
-          <w:hyperlink w:anchor="_Toc227613260" w:history="1">
+          <w:hyperlink w:anchor="_Toc227663070" w:history="1">
             <w:r>
               <w:rPr>
                 <w:rStyle w:val="ab"/>
                 <w:rFonts w:eastAsiaTheme="majorEastAsia"/>
                 <w:noProof/>
               </w:rPr>
-              <w:t>Стохастическая политика (Softmax vs Argmax)</w:t>
+              <w:t>Стохастическая политика</w:t>
             </w:r>
             <w:r>
               <w:rPr>
@@ -1742,7 +1742,7 @@
                 <w:noProof/>
                 <w:webHidden/>
               </w:rPr>
-              <w:instrText xml:space="preserve"> PAGEREF _Toc227613260 \h </w:instrText>
+              <w:instrText xml:space="preserve"> PAGEREF _Toc227663070 \h </w:instrText>
             </w:r>
             <w:r>
               <w:rPr>
@@ -1786,7 +1786,7 @@
               <w:szCs w:val="22"/>
             </w:rPr>
           </w:pPr>
-          <w:hyperlink w:anchor="_Toc227613261" w:history="1">
+          <w:hyperlink w:anchor="_Toc227663071" w:history="1">
             <w:r>
               <w:rPr>
                 <w:rStyle w:val="ab"/>
@@ -1814,7 +1814,7 @@
                 <w:noProof/>
                 <w:webHidden/>
               </w:rPr>
-              <w:instrText xml:space="preserve"> PAGEREF _Toc227613261 \h </w:instrText>
+              <w:instrText xml:space="preserve"> PAGEREF _Toc227663071 \h </w:instrText>
             </w:r>
             <w:r>
               <w:rPr>
@@ -1858,7 +1858,7 @@
               <w:szCs w:val="22"/>
             </w:rPr>
           </w:pPr>
-          <w:hyperlink w:anchor="_Toc227613262" w:history="1">
+          <w:hyperlink w:anchor="_Toc227663072" w:history="1">
             <w:r>
               <w:rPr>
                 <w:rStyle w:val="ab"/>
@@ -1886,7 +1886,7 @@
                 <w:noProof/>
                 <w:webHidden/>
               </w:rPr>
-              <w:instrText xml:space="preserve"> PAGEREF _Toc227613262 \h </w:instrText>
+              <w:instrText xml:space="preserve"> PAGEREF _Toc227663072 \h </w:instrText>
             </w:r>
             <w:r>
               <w:rPr>
@@ -1930,7 +1930,7 @@
               <w:szCs w:val="22"/>
             </w:rPr>
           </w:pPr>
-          <w:hyperlink w:anchor="_Toc227613263" w:history="1">
+          <w:hyperlink w:anchor="_Toc227663073" w:history="1">
             <w:r>
               <w:rPr>
                 <w:rStyle w:val="ab"/>
@@ -1988,7 +1988,7 @@
                 <w:noProof/>
                 <w:webHidden/>
               </w:rPr>
-              <w:instrText xml:space="preserve"> PAGEREF _Toc227613263 \h </w:instrText>
+              <w:instrText xml:space="preserve"> PAGEREF _Toc227663073 \h </w:instrText>
             </w:r>
             <w:r>
               <w:rPr>
@@ -2032,7 +2032,7 @@
               <w:szCs w:val="22"/>
             </w:rPr>
           </w:pPr>
-          <w:hyperlink w:anchor="_Toc227613264" w:history="1">
+          <w:hyperlink w:anchor="_Toc227663074" w:history="1">
             <w:r>
               <w:rPr>
                 <w:rStyle w:val="ab"/>
@@ -2060,7 +2060,7 @@
                 <w:noProof/>
                 <w:webHidden/>
               </w:rPr>
-              <w:instrText xml:space="preserve"> PAGEREF _Toc227613264 \h </w:instrText>
+              <w:instrText xml:space="preserve"> PAGEREF _Toc227663074 \h </w:instrText>
             </w:r>
             <w:r>
               <w:rPr>
@@ -2104,7 +2104,7 @@
               <w:szCs w:val="22"/>
             </w:rPr>
           </w:pPr>
-          <w:hyperlink w:anchor="_Toc227613265" w:history="1">
+          <w:hyperlink w:anchor="_Toc227663075" w:history="1">
             <w:r>
               <w:rPr>
                 <w:rStyle w:val="ab"/>
@@ -2132,7 +2132,7 @@
                 <w:noProof/>
                 <w:webHidden/>
               </w:rPr>
-              <w:instrText xml:space="preserve"> PAGEREF _Toc227613265 \h </w:instrText>
+              <w:instrText xml:space="preserve"> PAGEREF _Toc227663075 \h </w:instrText>
             </w:r>
             <w:r>
               <w:rPr>
@@ -2176,7 +2176,7 @@
               <w:szCs w:val="22"/>
             </w:rPr>
           </w:pPr>
-          <w:hyperlink w:anchor="_Toc227613266" w:history="1">
+          <w:hyperlink w:anchor="_Toc227663076" w:history="1">
             <w:r>
               <w:rPr>
                 <w:rStyle w:val="ab"/>
@@ -2204,7 +2204,7 @@
                 <w:noProof/>
                 <w:webHidden/>
               </w:rPr>
-              <w:instrText xml:space="preserve"> PAGEREF _Toc227613266 \h </w:instrText>
+              <w:instrText xml:space="preserve"> PAGEREF _Toc227663076 \h </w:instrText>
             </w:r>
             <w:r>
               <w:rPr>
@@ -2224,7 +2224,7 @@
                 <w:noProof/>
                 <w:webHidden/>
               </w:rPr>
-              <w:t>17</w:t>
+              <w:t>18</w:t>
             </w:r>
             <w:r>
               <w:rPr>
@@ -2248,7 +2248,7 @@
               <w:szCs w:val="22"/>
             </w:rPr>
           </w:pPr>
-          <w:hyperlink w:anchor="_Toc227613267" w:history="1">
+          <w:hyperlink w:anchor="_Toc227663077" w:history="1">
             <w:r>
               <w:rPr>
                 <w:rStyle w:val="ab"/>
@@ -2276,7 +2276,7 @@
                 <w:noProof/>
                 <w:webHidden/>
               </w:rPr>
-              <w:instrText xml:space="preserve"> PAGEREF _Toc227613267 \h </w:instrText>
+              <w:instrText xml:space="preserve"> PAGEREF _Toc227663077 \h </w:instrText>
             </w:r>
             <w:r>
               <w:rPr>
@@ -2296,7 +2296,7 @@
                 <w:noProof/>
                 <w:webHidden/>
               </w:rPr>
-              <w:t>17</w:t>
+              <w:t>18</w:t>
             </w:r>
             <w:r>
               <w:rPr>
@@ -2320,7 +2320,7 @@
               <w:szCs w:val="22"/>
             </w:rPr>
           </w:pPr>
-          <w:hyperlink w:anchor="_Toc227613268" w:history="1">
+          <w:hyperlink w:anchor="_Toc227663078" w:history="1">
             <w:r>
               <w:rPr>
                 <w:rStyle w:val="ab"/>
@@ -2348,7 +2348,7 @@
                 <w:noProof/>
                 <w:webHidden/>
               </w:rPr>
-              <w:instrText xml:space="preserve"> PAGEREF _Toc227613268 \h </w:instrText>
+              <w:instrText xml:space="preserve"> PAGEREF _Toc227663078 \h </w:instrText>
             </w:r>
             <w:r>
               <w:rPr>
@@ -2368,7 +2368,7 @@
                 <w:noProof/>
                 <w:webHidden/>
               </w:rPr>
-              <w:t>19</w:t>
+              <w:t>20</w:t>
             </w:r>
             <w:r>
               <w:rPr>
@@ -2392,7 +2392,7 @@
               <w:szCs w:val="22"/>
             </w:rPr>
           </w:pPr>
-          <w:hyperlink w:anchor="_Toc227613269" w:history="1">
+          <w:hyperlink w:anchor="_Toc227663079" w:history="1">
             <w:r>
               <w:rPr>
                 <w:rStyle w:val="ab"/>
@@ -2420,7 +2420,7 @@
                 <w:noProof/>
                 <w:webHidden/>
               </w:rPr>
-              <w:instrText xml:space="preserve"> PAGEREF _Toc227613269 \h </w:instrText>
+              <w:instrText xml:space="preserve"> PAGEREF _Toc227663079 \h </w:instrText>
             </w:r>
             <w:r>
               <w:rPr>
@@ -2440,7 +2440,7 @@
                 <w:noProof/>
                 <w:webHidden/>
               </w:rPr>
-              <w:t>20</w:t>
+              <w:t>21</w:t>
             </w:r>
             <w:r>
               <w:rPr>
@@ -2464,7 +2464,7 @@
               <w:szCs w:val="22"/>
             </w:rPr>
           </w:pPr>
-          <w:hyperlink w:anchor="_Toc227613270" w:history="1">
+          <w:hyperlink w:anchor="_Toc227663080" w:history="1">
             <w:r>
               <w:rPr>
                 <w:rStyle w:val="ab"/>
@@ -2492,7 +2492,7 @@
                 <w:noProof/>
                 <w:webHidden/>
               </w:rPr>
-              <w:instrText xml:space="preserve"> PAGEREF _Toc227613270 \h </w:instrText>
+              <w:instrText xml:space="preserve"> PAGEREF _Toc227663080 \h </w:instrText>
             </w:r>
             <w:r>
               <w:rPr>
@@ -2512,7 +2512,7 @@
                 <w:noProof/>
                 <w:webHidden/>
               </w:rPr>
-              <w:t>21</w:t>
+              <w:t>22</w:t>
             </w:r>
             <w:r>
               <w:rPr>
@@ -2562,7 +2562,7 @@
       <w:pPr>
         <w:pStyle w:val="1"/>
       </w:pPr>
-      <w:bookmarkStart w:id="1" w:name="_Toc227613246"/>
+      <w:bookmarkStart w:id="1" w:name="_Toc227663056"/>
       <w:r>
         <w:lastRenderedPageBreak/>
         <w:t>ВВЕДЕНИЕ</w:t>
@@ -2666,15 +2666,13 @@
         <w:t>)</w:t>
       </w:r>
       <w:r>
-        <w:t xml:space="preserve">, рассматривается улучшенная система </w:t>
-      </w:r>
-      <w:proofErr w:type="spellStart"/>
-      <w:r>
-        <w:t>вознограждений</w:t>
-      </w:r>
-      <w:proofErr w:type="spellEnd"/>
-      <w:r>
-        <w:t xml:space="preserve"> с целью усовершенствования и оптимизации обучения </w:t>
+        <w:t>, рассматривается улучшенная система возн</w:t>
+      </w:r>
+      <w:r>
+        <w:t>а</w:t>
+      </w:r>
+      <w:r>
+        <w:t xml:space="preserve">граждений с целью усовершенствования и оптимизации обучения </w:t>
       </w:r>
       <w:proofErr w:type="spellStart"/>
       <w:r>
@@ -2712,7 +2710,7 @@
           <w:caps/>
         </w:rPr>
       </w:pPr>
-      <w:bookmarkStart w:id="2" w:name="_Toc227613247"/>
+      <w:bookmarkStart w:id="2" w:name="_Toc227663057"/>
       <w:r>
         <w:rPr>
           <w:rFonts w:cs="Times New Roman"/>
@@ -2752,7 +2750,7 @@
       <w:pPr>
         <w:pStyle w:val="1"/>
       </w:pPr>
-      <w:bookmarkStart w:id="3" w:name="_Toc227613248"/>
+      <w:bookmarkStart w:id="3" w:name="_Toc227663058"/>
       <w:r>
         <w:t>Обучение с подкреплением (</w:t>
       </w:r>
@@ -3329,7 +3327,7 @@
         <w:pStyle w:val="1"/>
         <w:spacing w:line="276" w:lineRule="auto"/>
       </w:pPr>
-      <w:bookmarkStart w:id="4" w:name="_Toc227613249"/>
+      <w:bookmarkStart w:id="4" w:name="_Toc227663059"/>
       <w:r>
         <w:t xml:space="preserve">Архитектура </w:t>
       </w:r>
@@ -3417,15 +3415,7 @@
         <w:jc w:val="both"/>
       </w:pPr>
       <w:r>
-        <w:t>сеть Актера (</w:t>
-      </w:r>
-      <w:proofErr w:type="spellStart"/>
-      <w:r>
-        <w:t>Actor</w:t>
-      </w:r>
-      <w:proofErr w:type="spellEnd"/>
-      <w:r>
-        <w:t>): отвечает за принятие решений. Она принимает на вход наблюдение агента (неполную информацию, доступную игроку) и выдает распределение вероятностей действий</w:t>
+        <w:t>сеть Актера: отвечает за принятие решений. Она принимает на вход наблюдение агента (неполную информацию, доступную игроку) и выдает распределение вероятностей действий</w:t>
       </w:r>
       <w:r>
         <w:t>;</w:t>
@@ -3442,15 +3432,7 @@
         <w:jc w:val="both"/>
       </w:pPr>
       <w:r>
-        <w:t>сеть Критика (</w:t>
-      </w:r>
-      <w:proofErr w:type="spellStart"/>
-      <w:r>
-        <w:t>Critic</w:t>
-      </w:r>
-      <w:proofErr w:type="spellEnd"/>
-      <w:r>
-        <w:t>): оценивает действия Актера. Главная особенность применения этого метода в покере заключается в том, что Критик может обучаться на основе полной информации о состоянии игры, включая карты оппонентов, которая доступна на этапе тренировки, но недоступна во время реальной игры.</w:t>
+        <w:t>сеть Критика: оценивает действия Актера. Главная особенность применения этого метода в покере заключается в том, что Критик может обучаться на основе полной информации о состоянии игры, включая карты оппонентов, которая доступна на этапе тренировки, но недоступна во время реальной игры.</w:t>
       </w:r>
       <w:r>
         <w:t xml:space="preserve">  </w:t>
@@ -3660,7 +3642,7 @@
           </mc:Choice>
           <mc:Fallback>
             <w:pict>
-              <v:rect w14:anchorId="59D3067C" id="Прямоугольник 5" o:spid="_x0000_s1026" style="position:absolute;margin-left:206.4pt;margin-top:64.75pt;width:48.95pt;height:42.05pt;z-index:251661312;visibility:visible;mso-wrap-style:square;mso-wrap-distance-left:9pt;mso-wrap-distance-top:0;mso-wrap-distance-right:9pt;mso-wrap-distance-bottom:0;mso-position-horizontal:absolute;mso-position-horizontal-relative:text;mso-position-vertical:absolute;mso-position-vertical-relative:text;v-text-anchor:middle" o:gfxdata="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" fillcolor="white [3212]" strokecolor="white [3212]" strokeweight="1pt"/>
+              <v:rect w14:anchorId="1E9EEAB9" id="Прямоугольник 5" o:spid="_x0000_s1026" style="position:absolute;margin-left:206.4pt;margin-top:64.75pt;width:48.95pt;height:42.05pt;z-index:251661312;visibility:visible;mso-wrap-style:square;mso-wrap-distance-left:9pt;mso-wrap-distance-top:0;mso-wrap-distance-right:9pt;mso-wrap-distance-bottom:0;mso-position-horizontal:absolute;mso-position-horizontal-relative:text;mso-position-vertical:absolute;mso-position-vertical-relative:text;v-text-anchor:middle" o:gfxdata="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" fillcolor="white [3212]" strokecolor="white [3212]" strokeweight="1pt"/>
             </w:pict>
           </mc:Fallback>
         </mc:AlternateContent>
@@ -3761,7 +3743,7 @@
       <w:pPr>
         <w:pStyle w:val="1"/>
       </w:pPr>
-      <w:bookmarkStart w:id="5" w:name="_Toc227613250"/>
+      <w:bookmarkStart w:id="5" w:name="_Toc227663060"/>
       <w:r>
         <w:t>Метод остаточного обучения и преодоление стагнации оптимизации</w:t>
       </w:r>
@@ -3858,7 +3840,7 @@
       <w:pPr>
         <w:pStyle w:val="2"/>
       </w:pPr>
-      <w:bookmarkStart w:id="6" w:name="_Toc227613251"/>
+      <w:bookmarkStart w:id="6" w:name="_Toc227663061"/>
       <w:r>
         <w:t>Исторические предпосылки возникновения метода</w:t>
       </w:r>
@@ -3937,7 +3919,7 @@
       <w:pPr>
         <w:pStyle w:val="2"/>
       </w:pPr>
-      <w:bookmarkStart w:id="7" w:name="_Toc227613252"/>
+      <w:bookmarkStart w:id="7" w:name="_Toc227663062"/>
       <w:r>
         <w:t>Практическое применение и современная актуальность</w:t>
       </w:r>
@@ -4082,7 +4064,7 @@
       <w:pPr>
         <w:pStyle w:val="2"/>
       </w:pPr>
-      <w:bookmarkStart w:id="8" w:name="_Toc227613253"/>
+      <w:bookmarkStart w:id="8" w:name="_Toc227663063"/>
       <w:r>
         <w:t>Описание метода остаточных связей</w:t>
       </w:r>
@@ -4537,7 +4519,7 @@
       <w:pPr>
         <w:pStyle w:val="1"/>
       </w:pPr>
-      <w:bookmarkStart w:id="9" w:name="_Toc227613254"/>
+      <w:bookmarkStart w:id="9" w:name="_Toc227663064"/>
       <w:r>
         <w:lastRenderedPageBreak/>
         <w:t>ГЛАВА II</w:t>
@@ -4551,7 +4533,7 @@
       <w:pPr>
         <w:pStyle w:val="1"/>
       </w:pPr>
-      <w:bookmarkStart w:id="10" w:name="_Toc227613255"/>
+      <w:bookmarkStart w:id="10" w:name="_Toc227663065"/>
       <w:r>
         <w:t>Стек технологий и интеграция модулей</w:t>
       </w:r>
@@ -4728,7 +4710,7 @@
       <w:pPr>
         <w:pStyle w:val="1"/>
       </w:pPr>
-      <w:bookmarkStart w:id="11" w:name="_Toc227613256"/>
+      <w:bookmarkStart w:id="11" w:name="_Toc227663066"/>
       <w:r>
         <w:t xml:space="preserve">Проектирование архитектуры </w:t>
       </w:r>
@@ -4810,15 +4792,7 @@
         <w:jc w:val="both"/>
       </w:pPr>
       <w:r>
-        <w:t>Сеть Актера (</w:t>
-      </w:r>
-      <w:proofErr w:type="spellStart"/>
-      <w:r>
-        <w:t>Actor</w:t>
-      </w:r>
-      <w:proofErr w:type="spellEnd"/>
-      <w:r>
-        <w:t xml:space="preserve"> Network):</w:t>
+        <w:t>Сеть Актера:</w:t>
       </w:r>
     </w:p>
     <w:p>
@@ -4926,9 +4900,6 @@
       </w:r>
       <w:proofErr w:type="spellEnd"/>
       <w:r>
-        <w:t xml:space="preserve"> (рис. 3.1)</w:t>
-      </w:r>
-      <w:r>
         <w:t>;</w:t>
       </w:r>
     </w:p>
@@ -4998,15 +4969,7 @@
         <w:jc w:val="both"/>
       </w:pPr>
       <w:r>
-        <w:t>Сеть Критика (</w:t>
-      </w:r>
-      <w:proofErr w:type="spellStart"/>
-      <w:r>
-        <w:t>Critic</w:t>
-      </w:r>
-      <w:proofErr w:type="spellEnd"/>
-      <w:r>
-        <w:t xml:space="preserve"> Network):</w:t>
+        <w:t>Сеть Критика:</w:t>
       </w:r>
     </w:p>
     <w:p>
@@ -5430,7 +5393,7 @@
       <w:pPr>
         <w:pStyle w:val="1"/>
       </w:pPr>
-      <w:bookmarkStart w:id="12" w:name="_Toc227613257"/>
+      <w:bookmarkStart w:id="12" w:name="_Toc227663067"/>
       <w:r>
         <w:t>Алгоритмы формирования вознаграждений и управление памятью</w:t>
       </w:r>
@@ -5832,7 +5795,7 @@
           <w:iCs/>
         </w:rPr>
       </w:pPr>
-      <w:bookmarkStart w:id="13" w:name="_Toc227613258"/>
+      <w:bookmarkStart w:id="13" w:name="_Toc227663068"/>
       <w:r>
         <w:t>Дисконтирование временных последовательностей</w:t>
       </w:r>
@@ -6125,7 +6088,7 @@
           <w:rStyle w:val="citation-32"/>
         </w:rPr>
       </w:pPr>
-      <w:bookmarkStart w:id="14" w:name="_Toc227613259"/>
+      <w:bookmarkStart w:id="14" w:name="_Toc227663069"/>
       <w:r>
         <w:t>Организация процесса обучения и оптимизация политики</w:t>
       </w:r>
@@ -6540,34 +6503,10 @@
           <w:rStyle w:val="citation-32"/>
         </w:rPr>
       </w:pPr>
-      <w:bookmarkStart w:id="15" w:name="_Toc227613260"/>
+      <w:bookmarkStart w:id="15" w:name="_Toc227663070"/>
       <w:r>
         <w:lastRenderedPageBreak/>
-        <w:t>Стохастическая политика (</w:t>
-      </w:r>
-      <w:proofErr w:type="spellStart"/>
-      <w:r>
-        <w:t>Softmax</w:t>
-      </w:r>
-      <w:proofErr w:type="spellEnd"/>
-      <w:r>
-        <w:t xml:space="preserve"> </w:t>
-      </w:r>
-      <w:proofErr w:type="spellStart"/>
-      <w:r>
-        <w:t>vs</w:t>
-      </w:r>
-      <w:proofErr w:type="spellEnd"/>
-      <w:r>
-        <w:t xml:space="preserve"> </w:t>
-      </w:r>
-      <w:proofErr w:type="spellStart"/>
-      <w:r>
-        <w:t>Argmax</w:t>
-      </w:r>
-      <w:proofErr w:type="spellEnd"/>
-      <w:r>
-        <w:t>)</w:t>
+        <w:t>Стохастическая политика</w:t>
       </w:r>
       <w:bookmarkEnd w:id="15"/>
     </w:p>
@@ -6590,6 +6529,8 @@
       <w:r>
         <w:rPr>
           <w:rStyle w:val="citation-32"/>
+          <w:i/>
+          <w:iCs/>
         </w:rPr>
         <w:t>Softmax</w:t>
       </w:r>
@@ -6640,16 +6581,12 @@
       <w:r>
         <w:rPr>
           <w:rStyle w:val="citation-32"/>
+          <w:i/>
+          <w:iCs/>
         </w:rPr>
         <w:t>Softmax</w:t>
       </w:r>
       <w:proofErr w:type="spellEnd"/>
-      <w:r>
-        <w:rPr>
-          <w:rStyle w:val="citation-32"/>
-        </w:rPr>
-        <w:t xml:space="preserve"> (Обучение)</w:t>
-      </w:r>
       <w:r>
         <w:rPr>
           <w:rStyle w:val="citation-32"/>
@@ -6689,6 +6626,8 @@
       <w:r>
         <w:rPr>
           <w:rStyle w:val="citation-32"/>
+          <w:i/>
+          <w:iCs/>
         </w:rPr>
         <w:t>Softmax</w:t>
       </w:r>
@@ -7106,16 +7045,12 @@
       <w:r>
         <w:rPr>
           <w:rStyle w:val="citation-32"/>
+          <w:i/>
+          <w:iCs/>
         </w:rPr>
         <w:t>Argmax</w:t>
       </w:r>
       <w:proofErr w:type="spellEnd"/>
-      <w:r>
-        <w:rPr>
-          <w:rStyle w:val="citation-32"/>
-        </w:rPr>
-        <w:t xml:space="preserve"> (Тестирование)</w:t>
-      </w:r>
       <w:r>
         <w:rPr>
           <w:rStyle w:val="citation-32"/>
@@ -7143,6 +7078,8 @@
       <w:r>
         <w:rPr>
           <w:rStyle w:val="citation-32"/>
+          <w:i/>
+          <w:iCs/>
         </w:rPr>
         <w:t>Argmax</w:t>
       </w:r>
@@ -7322,6 +7259,8 @@
       <w:r>
         <w:rPr>
           <w:rStyle w:val="citation-32"/>
+          <w:i/>
+          <w:iCs/>
         </w:rPr>
         <w:t>Argmax</w:t>
       </w:r>
@@ -7336,6 +7275,8 @@
       <w:r>
         <w:rPr>
           <w:rStyle w:val="citation-32"/>
+          <w:i/>
+          <w:iCs/>
         </w:rPr>
         <w:t>Softmax</w:t>
       </w:r>
@@ -7402,21 +7343,19 @@
         <w:rPr>
           <w:rStyle w:val="citation-32"/>
         </w:rPr>
-        <w:t>епредсказуемости: в покере детерминированная стратегия (</w:t>
-      </w:r>
-      <w:proofErr w:type="spellStart"/>
+        <w:t>епредсказуемости: в покере детерминированная стратегия</w:t>
+      </w:r>
       <w:r>
         <w:rPr>
           <w:rStyle w:val="citation-32"/>
         </w:rPr>
-        <w:t>Argmax</w:t>
-      </w:r>
-      <w:proofErr w:type="spellEnd"/>
+        <w:t xml:space="preserve"> </w:t>
+      </w:r>
       <w:r>
         <w:rPr>
           <w:rStyle w:val="citation-32"/>
         </w:rPr>
-        <w:t>) легко эксплуатируется оппонентами.</w:t>
+        <w:t>легко эксплуатируется оппонентами.</w:t>
       </w:r>
     </w:p>
     <w:p>
@@ -7437,6 +7376,8 @@
       <w:r>
         <w:rPr>
           <w:rStyle w:val="citation-32"/>
+          <w:i/>
+          <w:iCs/>
         </w:rPr>
         <w:t>Softmax</w:t>
       </w:r>
@@ -7451,6 +7392,8 @@
       <w:r>
         <w:rPr>
           <w:rStyle w:val="citation-32"/>
+          <w:i/>
+          <w:iCs/>
         </w:rPr>
         <w:t>Argmax</w:t>
       </w:r>
@@ -7478,7 +7421,7 @@
       <w:pPr>
         <w:pStyle w:val="2"/>
       </w:pPr>
-      <w:bookmarkStart w:id="16" w:name="_Toc227613261"/>
+      <w:bookmarkStart w:id="16" w:name="_Toc227663071"/>
       <w:r>
         <w:t>Диагностический инструментарий и анализ функций потерь</w:t>
       </w:r>
@@ -8790,7 +8733,7 @@
           <w:rStyle w:val="citation-32"/>
         </w:rPr>
       </w:pPr>
-      <w:bookmarkStart w:id="17" w:name="_Toc227613262"/>
+      <w:bookmarkStart w:id="17" w:name="_Toc227663072"/>
       <w:r>
         <w:t>Метрики валидации и инструменты отладки</w:t>
       </w:r>
@@ -9027,29 +8970,6 @@
         <w:t xml:space="preserve"> для функции преимущества</w:t>
       </w:r>
       <w:r>
-        <w:t xml:space="preserve">, так как </w:t>
-      </w:r>
-      <w:proofErr w:type="spellStart"/>
-      <w:r>
-        <w:t>дебаг</w:t>
-      </w:r>
-      <w:proofErr w:type="spellEnd"/>
-      <w:r>
-        <w:t xml:space="preserve"> показал, что нормализация </w:t>
-      </w:r>
-      <w:r>
-        <w:t>не принимала во внимание</w:t>
-      </w:r>
-      <w:r>
-        <w:t xml:space="preserve"> </w:t>
-      </w:r>
-      <w:r>
-        <w:t xml:space="preserve">внедренные </w:t>
-      </w:r>
-      <w:r>
-        <w:t>признаки силы руки</w:t>
-      </w:r>
-      <w:r>
         <w:t>.</w:t>
       </w:r>
     </w:p>
@@ -9072,7 +8992,7 @@
         </w:rPr>
       </w:pPr>
       <w:bookmarkStart w:id="18" w:name="_Toc185161292"/>
-      <w:bookmarkStart w:id="19" w:name="_Toc227613263"/>
+      <w:bookmarkStart w:id="19" w:name="_Toc227663073"/>
       <w:r>
         <w:rPr>
           <w:rFonts w:cs="Times New Roman"/>
@@ -9112,7 +9032,7 @@
         <w:pStyle w:val="1"/>
         <w:spacing w:line="276" w:lineRule="auto"/>
       </w:pPr>
-      <w:bookmarkStart w:id="20" w:name="_Toc227613264"/>
+      <w:bookmarkStart w:id="20" w:name="_Toc227663074"/>
       <w:r>
         <w:t>Методика проведения экспериментов и метрики оценки</w:t>
       </w:r>
@@ -9311,6 +9231,10 @@
       </w:r>
       <w:proofErr w:type="spellStart"/>
       <w:r>
+        <w:rPr>
+          <w:i/>
+          <w:iCs/>
+        </w:rPr>
         <w:t>Softmax</w:t>
       </w:r>
       <w:proofErr w:type="spellEnd"/>
@@ -9319,6 +9243,10 @@
       </w:r>
       <w:proofErr w:type="spellStart"/>
       <w:r>
+        <w:rPr>
+          <w:i/>
+          <w:iCs/>
+        </w:rPr>
         <w:t>Argmax</w:t>
       </w:r>
       <w:proofErr w:type="spellEnd"/>
@@ -9334,7 +9262,7 @@
           <w:szCs w:val="24"/>
         </w:rPr>
       </w:pPr>
-      <w:bookmarkStart w:id="21" w:name="_Toc227613265"/>
+      <w:bookmarkStart w:id="21" w:name="_Toc227663075"/>
       <w:r>
         <w:t>Базовое тестирование: игра против пассивного оппонента</w:t>
       </w:r>
@@ -9389,10 +9317,22 @@
         <w:jc w:val="both"/>
       </w:pPr>
       <w:r>
-        <w:t>Разработанная модель продемонстрировала способность к быстрой адаптации. Уже на отметке в 50 000 симуляций агент стабилизировал свою стратегию, достигнув показателя побед на уровне</w:t>
-      </w:r>
-      <w:r>
-        <w:t xml:space="preserve"> 80%</w:t>
+        <w:t xml:space="preserve">Разработанная модель продемонстрировала способность к быстрой адаптации. Уже на отметке в </w:t>
+      </w:r>
+      <w:r>
+        <w:t>20</w:t>
+      </w:r>
+      <w:r>
+        <w:t xml:space="preserve"> 000 симуляций агент стабилизировал свою стратегию, достигнув показателя побед на уровне</w:t>
+      </w:r>
+      <w:r>
+        <w:t xml:space="preserve"> </w:t>
+      </w:r>
+      <w:r>
+        <w:t>73</w:t>
+      </w:r>
+      <w:r>
+        <w:t>%</w:t>
       </w:r>
       <w:r>
         <w:t xml:space="preserve">. Анализ распределения действий </w:t>
@@ -9400,20 +9340,6 @@
       <w:r>
         <w:lastRenderedPageBreak/>
         <w:t>показал, что нейросеть успешно выявила слабость оппонента: агент полностью исключил блеф из своей стратегии и начал максимизировать прибыль исключительно при наличии сильных комбинаций.</w:t>
-      </w:r>
-    </w:p>
-    <w:p>
-      <w:pPr>
-        <w:pStyle w:val="a4"/>
-        <w:spacing w:line="276" w:lineRule="auto"/>
-        <w:jc w:val="both"/>
-      </w:pPr>
-      <w:r>
-        <w:rPr>
-          <w:i/>
-          <w:iCs/>
-        </w:rPr>
-        <w:t>(Здесь вставишь график скользящего процента побед, который круто идет вверх до 80%)</w:t>
       </w:r>
     </w:p>
     <w:p>
@@ -9423,177 +9349,11 @@
         <w:jc w:val="center"/>
       </w:pPr>
       <w:r>
-        <w:t>Рисунок 3.1</w:t>
-      </w:r>
-      <w:r>
-        <w:t xml:space="preserve"> Динамика роста скользящего процента побед при игре против оппонента типа </w:t>
-      </w:r>
-      <w:proofErr w:type="spellStart"/>
-      <w:r>
-        <w:t>Calling</w:t>
-      </w:r>
-      <w:proofErr w:type="spellEnd"/>
-      <w:r>
-        <w:t xml:space="preserve"> </w:t>
-      </w:r>
-      <w:r>
-        <w:rPr>
-          <w:lang w:val="en-US"/>
-        </w:rPr>
-        <w:t>Player</w:t>
-      </w:r>
-      <w:r>
-        <w:t>.</w:t>
-      </w:r>
-    </w:p>
-    <w:p>
-      <w:pPr>
-        <w:pStyle w:val="1"/>
-        <w:rPr>
-          <w:sz w:val="24"/>
-          <w:szCs w:val="24"/>
-        </w:rPr>
-      </w:pPr>
-      <w:bookmarkStart w:id="22" w:name="_Toc227613266"/>
-      <w:r>
-        <w:t>Анализ эффективности против агрессивных стратегий</w:t>
-      </w:r>
-      <w:bookmarkEnd w:id="22"/>
-    </w:p>
-    <w:p>
-      <w:pPr>
-        <w:pStyle w:val="a4"/>
-        <w:spacing w:line="276" w:lineRule="auto"/>
-        <w:jc w:val="both"/>
-      </w:pPr>
-      <w:r>
-        <w:t xml:space="preserve">Второй, более сложный этап экспериментов заключался в противостоянии Агрессивному боту. Данный оппонент принимает решения строго на основе математической силы руки: он активно </w:t>
-      </w:r>
-      <w:r>
-        <w:t>принимает агрессивные решения</w:t>
-      </w:r>
-      <w:r>
-        <w:t xml:space="preserve"> с сильными картами, редко блефует и сбрасывает мусорные руки. Такой стиль игры максимально приближен к </w:t>
-      </w:r>
-      <w:proofErr w:type="spellStart"/>
-      <w:r>
-        <w:t>тайтово</w:t>
-      </w:r>
-      <w:proofErr w:type="spellEnd"/>
-      <w:r>
-        <w:t xml:space="preserve">-агрессивному стилю реальных игроков и представляет серьезную сложность для </w:t>
-      </w:r>
-      <w:proofErr w:type="spellStart"/>
-      <w:r>
-        <w:t>нейросетевых</w:t>
-      </w:r>
-      <w:proofErr w:type="spellEnd"/>
-      <w:r>
-        <w:t xml:space="preserve"> агентов.</w:t>
-      </w:r>
-    </w:p>
-    <w:p>
-      <w:pPr>
-        <w:pStyle w:val="a4"/>
-        <w:spacing w:line="276" w:lineRule="auto"/>
-        <w:jc w:val="both"/>
-      </w:pPr>
-      <w:r>
-        <w:t xml:space="preserve">В ходе симуляции </w:t>
-      </w:r>
-      <w:r>
-        <w:t>по истечению около 5</w:t>
-      </w:r>
-      <w:r>
-        <w:t xml:space="preserve">00 000 раздач агент продемонстрировал итоговый процент побед на уровне </w:t>
-      </w:r>
-      <w:r>
-        <w:t>58%</w:t>
-      </w:r>
-      <w:r>
-        <w:t>. Этот результат является статистически значимым подтверждением превосходства разработанной модели, так как в покере преимущество даже в несколько процентов на дистанции гарантирует стабильную прибыль.</w:t>
-      </w:r>
-    </w:p>
-    <w:p>
-      <w:pPr>
-        <w:pStyle w:val="a4"/>
-        <w:spacing w:line="276" w:lineRule="auto"/>
-        <w:jc w:val="both"/>
-      </w:pPr>
-      <w:r>
-        <w:t xml:space="preserve">Сравнительный анализ с результатами предыдущей итерации алгоритма (базовая модель без остаточных связей) показал </w:t>
-      </w:r>
-      <w:r>
-        <w:t xml:space="preserve">прирост эффективности на 7% </w:t>
-      </w:r>
-      <w:r>
-        <w:t>(с 51% до 58%). Преодоление стагнации в 51% стало возможным исключительно благодаря:</w:t>
-      </w:r>
-    </w:p>
-    <w:p>
-      <w:pPr>
-        <w:pStyle w:val="a4"/>
-        <w:numPr>
-          <w:ilvl w:val="0"/>
-          <w:numId w:val="34"/>
-        </w:numPr>
-        <w:spacing w:before="100" w:beforeAutospacing="1" w:after="100" w:afterAutospacing="1" w:line="276" w:lineRule="auto"/>
-        <w:jc w:val="both"/>
-      </w:pPr>
-      <w:r>
-        <w:t xml:space="preserve">Внедрению </w:t>
-      </w:r>
-      <w:proofErr w:type="spellStart"/>
-      <w:r>
-        <w:t>Skip</w:t>
-      </w:r>
-      <w:proofErr w:type="spellEnd"/>
-      <w:r>
-        <w:t xml:space="preserve"> </w:t>
-      </w:r>
-      <w:proofErr w:type="spellStart"/>
-      <w:r>
-        <w:t>Connections</w:t>
-      </w:r>
-      <w:proofErr w:type="spellEnd"/>
-      <w:r>
-        <w:t>, которые позволили сети сохранять информацию о силе руки на самых глубоких слоях абстракции.</w:t>
-      </w:r>
-    </w:p>
-    <w:p>
-      <w:pPr>
-        <w:pStyle w:val="a4"/>
-        <w:numPr>
-          <w:ilvl w:val="0"/>
-          <w:numId w:val="34"/>
-        </w:numPr>
-        <w:spacing w:before="100" w:beforeAutospacing="1" w:after="100" w:afterAutospacing="1" w:line="276" w:lineRule="auto"/>
-        <w:jc w:val="both"/>
-      </w:pPr>
-      <w:r>
-        <w:t>Отказу от излишней нормализации после прохождения рубежа в 50%, что позволило агенту более остро реагировать на агрессию оппонента.</w:t>
-      </w:r>
-    </w:p>
-    <w:p>
-      <w:pPr>
-        <w:pStyle w:val="a4"/>
-        <w:spacing w:line="276" w:lineRule="auto"/>
-        <w:jc w:val="center"/>
-        <w:rPr>
-          <w:noProof/>
-        </w:rPr>
-      </w:pPr>
-      <w:r>
-        <w:rPr>
-          <w:b/>
-          <w:bCs/>
-        </w:rPr>
-        <w:lastRenderedPageBreak/>
         <w:drawing>
-          <wp:inline distT="0" distB="0" distL="0" distR="0" wp14:anchorId="21AEDF0B" wp14:editId="5D14489C">
-            <wp:extent cx="3555242" cy="2196990"/>
-            <wp:effectExtent l="0" t="0" r="7620" b="0"/>
-            <wp:docPr id="12" name="Рисунок 12"/>
+          <wp:inline distT="0" distB="0" distL="0" distR="0" wp14:anchorId="5F7591BA" wp14:editId="0D40183B">
+            <wp:extent cx="3498574" cy="1779392"/>
+            <wp:effectExtent l="0" t="0" r="6985" b="0"/>
+            <wp:docPr id="17" name="Рисунок 17"/>
             <wp:cNvGraphicFramePr>
               <a:graphicFrameLocks xmlns:a="http://schemas.openxmlformats.org/drawingml/2006/main" noChangeAspect="1"/>
             </wp:cNvGraphicFramePr>
@@ -9613,7 +9373,7 @@
                   <pic:spPr>
                     <a:xfrm>
                       <a:off x="0" y="0"/>
-                      <a:ext cx="3590751" cy="2218933"/>
+                      <a:ext cx="3507772" cy="1784070"/>
                     </a:xfrm>
                     <a:prstGeom prst="rect">
                       <a:avLst/>
@@ -9625,16 +9385,19 @@
           </wp:inline>
         </w:drawing>
       </w:r>
-      <w:r>
-        <w:rPr>
-          <w:b/>
-          <w:bCs/>
-        </w:rPr>
+    </w:p>
+    <w:p>
+      <w:pPr>
+        <w:pStyle w:val="a4"/>
+        <w:spacing w:line="276" w:lineRule="auto"/>
+        <w:jc w:val="center"/>
+      </w:pPr>
+      <w:r>
         <w:drawing>
-          <wp:inline distT="0" distB="0" distL="0" distR="0" wp14:anchorId="4178FBC9" wp14:editId="7D69E4FD">
-            <wp:extent cx="3459707" cy="2134762"/>
-            <wp:effectExtent l="0" t="0" r="7620" b="0"/>
-            <wp:docPr id="14" name="Рисунок 14"/>
+          <wp:inline distT="0" distB="0" distL="0" distR="0" wp14:anchorId="38029494" wp14:editId="4359839A">
+            <wp:extent cx="3458817" cy="1787642"/>
+            <wp:effectExtent l="0" t="0" r="8890" b="3175"/>
+            <wp:docPr id="18" name="Рисунок 18"/>
             <wp:cNvGraphicFramePr>
               <a:graphicFrameLocks xmlns:a="http://schemas.openxmlformats.org/drawingml/2006/main" noChangeAspect="1"/>
             </wp:cNvGraphicFramePr>
@@ -9654,7 +9417,7 @@
                   <pic:spPr>
                     <a:xfrm>
                       <a:off x="0" y="0"/>
-                      <a:ext cx="3496103" cy="2157220"/>
+                      <a:ext cx="3488216" cy="1802837"/>
                     </a:xfrm>
                     <a:prstGeom prst="rect">
                       <a:avLst/>
@@ -9672,21 +9435,13 @@
         <w:pStyle w:val="a4"/>
         <w:spacing w:line="276" w:lineRule="auto"/>
         <w:jc w:val="center"/>
-        <w:rPr>
-          <w:b/>
-          <w:bCs/>
-        </w:rPr>
-      </w:pPr>
-      <w:r>
-        <w:rPr>
-          <w:b/>
-          <w:bCs/>
-        </w:rPr>
+      </w:pPr>
+      <w:r>
         <w:drawing>
-          <wp:inline distT="0" distB="0" distL="0" distR="0" wp14:anchorId="62A99A0F" wp14:editId="3863F4F1">
-            <wp:extent cx="3874957" cy="1596788"/>
-            <wp:effectExtent l="0" t="0" r="0" b="3810"/>
-            <wp:docPr id="15" name="Рисунок 15"/>
+          <wp:inline distT="0" distB="0" distL="0" distR="0" wp14:anchorId="18B0A191" wp14:editId="0C7AFF4E">
+            <wp:extent cx="3699437" cy="1486893"/>
+            <wp:effectExtent l="0" t="0" r="0" b="0"/>
+            <wp:docPr id="19" name="Рисунок 19"/>
             <wp:cNvGraphicFramePr>
               <a:graphicFrameLocks xmlns:a="http://schemas.openxmlformats.org/drawingml/2006/main" noChangeAspect="1"/>
             </wp:cNvGraphicFramePr>
@@ -9706,7 +9461,7 @@
                   <pic:spPr>
                     <a:xfrm>
                       <a:off x="0" y="0"/>
-                      <a:ext cx="3944252" cy="1625343"/>
+                      <a:ext cx="3726670" cy="1497839"/>
                     </a:xfrm>
                     <a:prstGeom prst="rect">
                       <a:avLst/>
@@ -9718,16 +9473,19 @@
           </wp:inline>
         </w:drawing>
       </w:r>
-      <w:r>
-        <w:rPr>
-          <w:b/>
-          <w:bCs/>
-        </w:rPr>
+    </w:p>
+    <w:p>
+      <w:pPr>
+        <w:pStyle w:val="a4"/>
+        <w:spacing w:line="276" w:lineRule="auto"/>
+        <w:jc w:val="center"/>
+      </w:pPr>
+      <w:r>
         <w:drawing>
-          <wp:inline distT="0" distB="0" distL="0" distR="0" wp14:anchorId="64DCC3AF" wp14:editId="60A0E7EE">
-            <wp:extent cx="3666671" cy="2013045"/>
-            <wp:effectExtent l="0" t="0" r="0" b="6350"/>
-            <wp:docPr id="16" name="Рисунок 16"/>
+          <wp:inline distT="0" distB="0" distL="0" distR="0" wp14:anchorId="04305CC5" wp14:editId="57F24B8B">
+            <wp:extent cx="3633746" cy="1843092"/>
+            <wp:effectExtent l="0" t="0" r="5080" b="5080"/>
+            <wp:docPr id="21" name="Рисунок 21"/>
             <wp:cNvGraphicFramePr>
               <a:graphicFrameLocks xmlns:a="http://schemas.openxmlformats.org/drawingml/2006/main" noChangeAspect="1"/>
             </wp:cNvGraphicFramePr>
@@ -9747,6 +9505,414 @@
                   <pic:spPr>
                     <a:xfrm>
                       <a:off x="0" y="0"/>
+                      <a:ext cx="3652526" cy="1852618"/>
+                    </a:xfrm>
+                    <a:prstGeom prst="rect">
+                      <a:avLst/>
+                    </a:prstGeom>
+                  </pic:spPr>
+                </pic:pic>
+              </a:graphicData>
+            </a:graphic>
+          </wp:inline>
+        </w:drawing>
+      </w:r>
+    </w:p>
+    <w:p>
+      <w:pPr>
+        <w:pStyle w:val="a4"/>
+        <w:spacing w:line="276" w:lineRule="auto"/>
+        <w:jc w:val="both"/>
+      </w:pPr>
+    </w:p>
+    <w:p>
+      <w:pPr>
+        <w:pStyle w:val="a4"/>
+        <w:spacing w:line="276" w:lineRule="auto"/>
+        <w:jc w:val="center"/>
+      </w:pPr>
+      <w:r>
+        <w:t>Рисунок 3.1</w:t>
+      </w:r>
+      <w:r>
+        <w:t>. Сравнительные графики модели с остаточными связями</w:t>
+      </w:r>
+      <w:r>
+        <w:t xml:space="preserve"> </w:t>
+      </w:r>
+      <w:r>
+        <w:t xml:space="preserve">против оппонента типа </w:t>
+      </w:r>
+      <w:r>
+        <w:t>«</w:t>
+      </w:r>
+      <w:proofErr w:type="spellStart"/>
+      <w:r>
+        <w:t>Calling</w:t>
+      </w:r>
+      <w:proofErr w:type="spellEnd"/>
+      <w:r>
+        <w:t xml:space="preserve"> </w:t>
+      </w:r>
+      <w:r>
+        <w:rPr>
+          <w:lang w:val="en-US"/>
+        </w:rPr>
+        <w:t>Player</w:t>
+      </w:r>
+      <w:r>
+        <w:t>»</w:t>
+      </w:r>
+      <w:r>
+        <w:t>.</w:t>
+      </w:r>
+    </w:p>
+    <w:p>
+      <w:pPr>
+        <w:pStyle w:val="1"/>
+        <w:rPr>
+          <w:sz w:val="24"/>
+          <w:szCs w:val="24"/>
+        </w:rPr>
+      </w:pPr>
+      <w:bookmarkStart w:id="22" w:name="_Toc227663076"/>
+      <w:r>
+        <w:lastRenderedPageBreak/>
+        <w:t>Анализ эффективности против агрессивных стратегий</w:t>
+      </w:r>
+      <w:bookmarkEnd w:id="22"/>
+    </w:p>
+    <w:p>
+      <w:pPr>
+        <w:pStyle w:val="a4"/>
+        <w:spacing w:line="276" w:lineRule="auto"/>
+        <w:jc w:val="both"/>
+      </w:pPr>
+      <w:r>
+        <w:t xml:space="preserve">Второй, более сложный этап экспериментов заключался в противостоянии Агрессивному боту. Данный оппонент принимает решения строго на основе математической силы руки: он активно </w:t>
+      </w:r>
+      <w:r>
+        <w:t>принимает агрессивные решения</w:t>
+      </w:r>
+      <w:r>
+        <w:t xml:space="preserve"> с сильными картами, редко блефует и сбрасывает мусорные руки. Такой стиль игры максимально приближен к </w:t>
+      </w:r>
+      <w:proofErr w:type="spellStart"/>
+      <w:r>
+        <w:t>тайтово</w:t>
+      </w:r>
+      <w:proofErr w:type="spellEnd"/>
+      <w:r>
+        <w:t xml:space="preserve">-агрессивному стилю реальных игроков и представляет серьезную сложность для </w:t>
+      </w:r>
+      <w:proofErr w:type="spellStart"/>
+      <w:r>
+        <w:t>нейросетевых</w:t>
+      </w:r>
+      <w:proofErr w:type="spellEnd"/>
+      <w:r>
+        <w:t xml:space="preserve"> агентов.</w:t>
+      </w:r>
+    </w:p>
+    <w:p>
+      <w:pPr>
+        <w:pStyle w:val="a4"/>
+        <w:spacing w:line="276" w:lineRule="auto"/>
+        <w:jc w:val="both"/>
+      </w:pPr>
+      <w:r>
+        <w:t xml:space="preserve">В ходе симуляции </w:t>
+      </w:r>
+      <w:r>
+        <w:t>по истечению около 5</w:t>
+      </w:r>
+      <w:r>
+        <w:t xml:space="preserve">00 000 раздач агент продемонстрировал итоговый процент побед на уровне </w:t>
+      </w:r>
+      <w:r>
+        <w:t>58%</w:t>
+      </w:r>
+      <w:r>
+        <w:t>. Этот результат является статистически значимым подтверждением превосходства разработанной модели, так как в покере преимущество даже в несколько процентов на дистанции гарантирует стабильную прибыль.</w:t>
+      </w:r>
+    </w:p>
+    <w:p>
+      <w:pPr>
+        <w:pStyle w:val="a4"/>
+        <w:spacing w:line="276" w:lineRule="auto"/>
+        <w:jc w:val="both"/>
+      </w:pPr>
+      <w:r>
+        <w:t xml:space="preserve">Сравнительный анализ с результатами предыдущей итерации алгоритма (базовая модель без остаточных связей) показал </w:t>
+      </w:r>
+      <w:r>
+        <w:t xml:space="preserve">прирост эффективности на 7% </w:t>
+      </w:r>
+      <w:r>
+        <w:t>(с 51% до 58%). Преодоление стагнации в 51% стало возможным исключительно благодаря:</w:t>
+      </w:r>
+    </w:p>
+    <w:p>
+      <w:pPr>
+        <w:pStyle w:val="a4"/>
+        <w:numPr>
+          <w:ilvl w:val="0"/>
+          <w:numId w:val="34"/>
+        </w:numPr>
+        <w:spacing w:before="100" w:beforeAutospacing="1" w:after="100" w:afterAutospacing="1" w:line="276" w:lineRule="auto"/>
+        <w:jc w:val="both"/>
+      </w:pPr>
+      <w:r>
+        <w:t xml:space="preserve">Внедрению </w:t>
+      </w:r>
+      <w:proofErr w:type="spellStart"/>
+      <w:r>
+        <w:t>Skip</w:t>
+      </w:r>
+      <w:proofErr w:type="spellEnd"/>
+      <w:r>
+        <w:t xml:space="preserve"> </w:t>
+      </w:r>
+      <w:proofErr w:type="spellStart"/>
+      <w:r>
+        <w:t>Connections</w:t>
+      </w:r>
+      <w:proofErr w:type="spellEnd"/>
+      <w:r>
+        <w:t>, которые позволили сети сохранять информацию о силе руки на самых глубоких слоях абстракции.</w:t>
+      </w:r>
+    </w:p>
+    <w:p>
+      <w:pPr>
+        <w:pStyle w:val="a4"/>
+        <w:numPr>
+          <w:ilvl w:val="0"/>
+          <w:numId w:val="34"/>
+        </w:numPr>
+        <w:spacing w:before="100" w:beforeAutospacing="1" w:after="100" w:afterAutospacing="1" w:line="276" w:lineRule="auto"/>
+        <w:jc w:val="both"/>
+      </w:pPr>
+      <w:r>
+        <w:t>Отказу от излишней нормализации после прохождения рубежа в 50%, что позволило агенту более остро реагировать на агрессию оппонента.</w:t>
+      </w:r>
+    </w:p>
+    <w:p>
+      <w:pPr>
+        <w:pStyle w:val="1"/>
+        <w:rPr>
+          <w:sz w:val="24"/>
+          <w:szCs w:val="24"/>
+        </w:rPr>
+      </w:pPr>
+      <w:bookmarkStart w:id="23" w:name="_Toc227663077"/>
+      <w:r>
+        <w:t>Анализ распределения действий и финальная валидация</w:t>
+      </w:r>
+      <w:bookmarkEnd w:id="23"/>
+    </w:p>
+    <w:p>
+      <w:pPr>
+        <w:pStyle w:val="a4"/>
+        <w:spacing w:line="276" w:lineRule="auto"/>
+      </w:pPr>
+      <w:r>
+        <w:t>Детальный анализ матрицы принятых решений показал, что модель сформировала математически обоснованную структуру игры. Распределение действий стабилизировалось и стало соответствовать фундаментальным принципам покера: высокий процент сброса слабых стартовых рук и агрессивный розыгрыш сильных спектров.</w:t>
+      </w:r>
+    </w:p>
+    <w:p>
+      <w:pPr>
+        <w:pStyle w:val="a4"/>
+        <w:spacing w:line="276" w:lineRule="auto"/>
+      </w:pPr>
+      <w:r>
+        <w:t xml:space="preserve">Для подтверждения универсальности полученных весов была проведена финальная валидация агента. Модель была переведена в режим эксплуатации (эксплуатационный выбор действий через </w:t>
+      </w:r>
+      <w:proofErr w:type="spellStart"/>
+      <w:r>
+        <w:rPr>
+          <w:i/>
+          <w:iCs/>
+        </w:rPr>
+        <w:t>Argmax</w:t>
+      </w:r>
+      <w:proofErr w:type="spellEnd"/>
+      <w:r>
+        <w:t>, отключение режима обучения). Агент провел серию тестовых партий против смешанного пула оппонентов (пассивные, агрессивные и случайные боты). Отсутствие падения процента побед на тестовой выборке подтвердило, что модель действительно обобщила правила извлечения выгоды, а не просто переобучилась под конкретного противника.</w:t>
+      </w:r>
+    </w:p>
+    <w:p>
+      <w:pPr>
+        <w:pStyle w:val="a4"/>
+        <w:spacing w:line="276" w:lineRule="auto"/>
+        <w:jc w:val="center"/>
+        <w:rPr>
+          <w:noProof/>
+        </w:rPr>
+      </w:pPr>
+      <w:r>
+        <w:rPr>
+          <w:b/>
+          <w:bCs/>
+        </w:rPr>
+        <w:lastRenderedPageBreak/>
+        <w:drawing>
+          <wp:inline distT="0" distB="0" distL="0" distR="0" wp14:anchorId="21AEDF0B" wp14:editId="5D14489C">
+            <wp:extent cx="3555242" cy="2196990"/>
+            <wp:effectExtent l="0" t="0" r="7620" b="0"/>
+            <wp:docPr id="12" name="Рисунок 12"/>
+            <wp:cNvGraphicFramePr>
+              <a:graphicFrameLocks xmlns:a="http://schemas.openxmlformats.org/drawingml/2006/main" noChangeAspect="1"/>
+            </wp:cNvGraphicFramePr>
+            <a:graphic xmlns:a="http://schemas.openxmlformats.org/drawingml/2006/main">
+              <a:graphicData uri="http://schemas.openxmlformats.org/drawingml/2006/picture">
+                <pic:pic xmlns:pic="http://schemas.openxmlformats.org/drawingml/2006/picture">
+                  <pic:nvPicPr>
+                    <pic:cNvPr id="1" name=""/>
+                    <pic:cNvPicPr/>
+                  </pic:nvPicPr>
+                  <pic:blipFill>
+                    <a:blip r:embed="rId15"/>
+                    <a:stretch>
+                      <a:fillRect/>
+                    </a:stretch>
+                  </pic:blipFill>
+                  <pic:spPr>
+                    <a:xfrm>
+                      <a:off x="0" y="0"/>
+                      <a:ext cx="3590751" cy="2218933"/>
+                    </a:xfrm>
+                    <a:prstGeom prst="rect">
+                      <a:avLst/>
+                    </a:prstGeom>
+                  </pic:spPr>
+                </pic:pic>
+              </a:graphicData>
+            </a:graphic>
+          </wp:inline>
+        </w:drawing>
+      </w:r>
+      <w:r>
+        <w:rPr>
+          <w:b/>
+          <w:bCs/>
+        </w:rPr>
+        <w:drawing>
+          <wp:inline distT="0" distB="0" distL="0" distR="0" wp14:anchorId="4178FBC9" wp14:editId="7D69E4FD">
+            <wp:extent cx="3459707" cy="2134762"/>
+            <wp:effectExtent l="0" t="0" r="7620" b="0"/>
+            <wp:docPr id="14" name="Рисунок 14"/>
+            <wp:cNvGraphicFramePr>
+              <a:graphicFrameLocks xmlns:a="http://schemas.openxmlformats.org/drawingml/2006/main" noChangeAspect="1"/>
+            </wp:cNvGraphicFramePr>
+            <a:graphic xmlns:a="http://schemas.openxmlformats.org/drawingml/2006/main">
+              <a:graphicData uri="http://schemas.openxmlformats.org/drawingml/2006/picture">
+                <pic:pic xmlns:pic="http://schemas.openxmlformats.org/drawingml/2006/picture">
+                  <pic:nvPicPr>
+                    <pic:cNvPr id="1" name=""/>
+                    <pic:cNvPicPr/>
+                  </pic:nvPicPr>
+                  <pic:blipFill>
+                    <a:blip r:embed="rId16"/>
+                    <a:stretch>
+                      <a:fillRect/>
+                    </a:stretch>
+                  </pic:blipFill>
+                  <pic:spPr>
+                    <a:xfrm>
+                      <a:off x="0" y="0"/>
+                      <a:ext cx="3496103" cy="2157220"/>
+                    </a:xfrm>
+                    <a:prstGeom prst="rect">
+                      <a:avLst/>
+                    </a:prstGeom>
+                  </pic:spPr>
+                </pic:pic>
+              </a:graphicData>
+            </a:graphic>
+          </wp:inline>
+        </w:drawing>
+      </w:r>
+    </w:p>
+    <w:p>
+      <w:pPr>
+        <w:pStyle w:val="a4"/>
+        <w:spacing w:line="276" w:lineRule="auto"/>
+        <w:jc w:val="center"/>
+        <w:rPr>
+          <w:b/>
+          <w:bCs/>
+        </w:rPr>
+      </w:pPr>
+      <w:r>
+        <w:rPr>
+          <w:b/>
+          <w:bCs/>
+        </w:rPr>
+        <w:drawing>
+          <wp:inline distT="0" distB="0" distL="0" distR="0" wp14:anchorId="62A99A0F" wp14:editId="3863F4F1">
+            <wp:extent cx="3874957" cy="1596788"/>
+            <wp:effectExtent l="0" t="0" r="0" b="3810"/>
+            <wp:docPr id="15" name="Рисунок 15"/>
+            <wp:cNvGraphicFramePr>
+              <a:graphicFrameLocks xmlns:a="http://schemas.openxmlformats.org/drawingml/2006/main" noChangeAspect="1"/>
+            </wp:cNvGraphicFramePr>
+            <a:graphic xmlns:a="http://schemas.openxmlformats.org/drawingml/2006/main">
+              <a:graphicData uri="http://schemas.openxmlformats.org/drawingml/2006/picture">
+                <pic:pic xmlns:pic="http://schemas.openxmlformats.org/drawingml/2006/picture">
+                  <pic:nvPicPr>
+                    <pic:cNvPr id="1" name=""/>
+                    <pic:cNvPicPr/>
+                  </pic:nvPicPr>
+                  <pic:blipFill>
+                    <a:blip r:embed="rId17"/>
+                    <a:stretch>
+                      <a:fillRect/>
+                    </a:stretch>
+                  </pic:blipFill>
+                  <pic:spPr>
+                    <a:xfrm>
+                      <a:off x="0" y="0"/>
+                      <a:ext cx="3944252" cy="1625343"/>
+                    </a:xfrm>
+                    <a:prstGeom prst="rect">
+                      <a:avLst/>
+                    </a:prstGeom>
+                  </pic:spPr>
+                </pic:pic>
+              </a:graphicData>
+            </a:graphic>
+          </wp:inline>
+        </w:drawing>
+      </w:r>
+      <w:r>
+        <w:rPr>
+          <w:b/>
+          <w:bCs/>
+        </w:rPr>
+        <w:drawing>
+          <wp:inline distT="0" distB="0" distL="0" distR="0" wp14:anchorId="64DCC3AF" wp14:editId="60A0E7EE">
+            <wp:extent cx="3666671" cy="2013045"/>
+            <wp:effectExtent l="0" t="0" r="0" b="6350"/>
+            <wp:docPr id="16" name="Рисунок 16"/>
+            <wp:cNvGraphicFramePr>
+              <a:graphicFrameLocks xmlns:a="http://schemas.openxmlformats.org/drawingml/2006/main" noChangeAspect="1"/>
+            </wp:cNvGraphicFramePr>
+            <a:graphic xmlns:a="http://schemas.openxmlformats.org/drawingml/2006/main">
+              <a:graphicData uri="http://schemas.openxmlformats.org/drawingml/2006/picture">
+                <pic:pic xmlns:pic="http://schemas.openxmlformats.org/drawingml/2006/picture">
+                  <pic:nvPicPr>
+                    <pic:cNvPr id="1" name=""/>
+                    <pic:cNvPicPr/>
+                  </pic:nvPicPr>
+                  <pic:blipFill>
+                    <a:blip r:embed="rId18"/>
+                    <a:stretch>
+                      <a:fillRect/>
+                    </a:stretch>
+                  </pic:blipFill>
+                  <pic:spPr>
+                    <a:xfrm>
+                      <a:off x="0" y="0"/>
                       <a:ext cx="3740470" cy="2053561"/>
                     </a:xfrm>
                     <a:prstGeom prst="rect">
@@ -9764,17 +9930,13 @@
       <w:pPr>
         <w:pStyle w:val="a4"/>
         <w:spacing w:line="276" w:lineRule="auto"/>
-        <w:jc w:val="both"/>
-      </w:pPr>
-      <w:r>
-        <w:rPr>
-          <w:b/>
-          <w:bCs/>
-        </w:rPr>
-        <w:t>Рис. 3.2.</w:t>
-      </w:r>
-      <w:r>
-        <w:t xml:space="preserve"> Сравнительны</w:t>
+        <w:jc w:val="center"/>
+      </w:pPr>
+      <w:r>
+        <w:t xml:space="preserve">Рисунок 3.2. </w:t>
+      </w:r>
+      <w:r>
+        <w:t>Сравнительны</w:t>
       </w:r>
       <w:r>
         <w:t>е</w:t>
@@ -9786,84 +9948,29 @@
         <w:t>и</w:t>
       </w:r>
       <w:r>
-        <w:t xml:space="preserve"> процента побед базовой модели и модели с остаточными связями (</w:t>
-      </w:r>
-      <w:proofErr w:type="spellStart"/>
-      <w:r>
-        <w:t>Skip</w:t>
-      </w:r>
-      <w:proofErr w:type="spellEnd"/>
+        <w:t xml:space="preserve"> модели с остаточными связями</w:t>
+      </w:r>
       <w:r>
         <w:t xml:space="preserve"> </w:t>
       </w:r>
-      <w:proofErr w:type="spellStart"/>
-      <w:r>
-        <w:t>Connections</w:t>
-      </w:r>
-      <w:proofErr w:type="spellEnd"/>
-      <w:r>
-        <w:t>) против Агрессивного оппонента.</w:t>
+      <w:r>
+        <w:t>против Агрессивного оппонента.</w:t>
       </w:r>
     </w:p>
     <w:p/>
     <w:p>
       <w:pPr>
+        <w:spacing w:after="160" w:line="259" w:lineRule="auto"/>
+      </w:pPr>
+      <w:r>
+        <w:br w:type="page"/>
+      </w:r>
+    </w:p>
+    <w:p>
+      <w:pPr>
         <w:pStyle w:val="1"/>
-        <w:rPr>
-          <w:sz w:val="24"/>
-          <w:szCs w:val="24"/>
-        </w:rPr>
-      </w:pPr>
-      <w:bookmarkStart w:id="23" w:name="_Toc227613267"/>
-      <w:r>
-        <w:lastRenderedPageBreak/>
-        <w:t>Анализ распределения действий и финальная валидация</w:t>
-      </w:r>
-      <w:bookmarkEnd w:id="23"/>
-    </w:p>
-    <w:p>
-      <w:pPr>
-        <w:pStyle w:val="a4"/>
-        <w:spacing w:line="276" w:lineRule="auto"/>
-      </w:pPr>
-      <w:r>
-        <w:t>Детальный анализ матрицы принятых решений показал, что модель сформировала математически обоснованную структуру игры. Распределение действий стабилизировалось и стало соответствовать фундаментальным принципам покера: высокий процент сброса слабых стартовых рук и агрессивный розыгрыш сильных спектров.</w:t>
-      </w:r>
-    </w:p>
-    <w:p>
-      <w:pPr>
-        <w:pStyle w:val="a4"/>
-        <w:spacing w:line="276" w:lineRule="auto"/>
-      </w:pPr>
-      <w:r>
-        <w:t xml:space="preserve">Для подтверждения универсальности полученных весов была проведена финальная валидация агента. Модель была переведена в режим эксплуатации (эксплуатационный выбор действий через </w:t>
-      </w:r>
-      <w:proofErr w:type="spellStart"/>
-      <w:r>
-        <w:rPr>
-          <w:i/>
-          <w:iCs/>
-        </w:rPr>
-        <w:t>Argmax</w:t>
-      </w:r>
-      <w:proofErr w:type="spellEnd"/>
-      <w:r>
-        <w:t>, отключение режима обучения). Агент провел серию тестовых партий против смешанного пула оппонентов (пассивные, агрессивные и случайные боты). Отсутствие падения процента побед на тестовой выборке подтвердило, что модель действительно обобщила правила извлечения выгоды, а не просто переобучилась под конкретного противника.</w:t>
-      </w:r>
-    </w:p>
-    <w:p>
-      <w:pPr>
-        <w:spacing w:after="160" w:line="259" w:lineRule="auto"/>
-      </w:pPr>
-      <w:r>
-        <w:br w:type="page"/>
-      </w:r>
-    </w:p>
-    <w:p>
-      <w:pPr>
-        <w:pStyle w:val="1"/>
-      </w:pPr>
-      <w:bookmarkStart w:id="24" w:name="_Toc227613268"/>
+      </w:pPr>
+      <w:bookmarkStart w:id="24" w:name="_Toc227663078"/>
       <w:r>
         <w:lastRenderedPageBreak/>
         <w:t>ЗАКЛЮЧЕНИЕ</w:t>
@@ -9982,7 +10089,28 @@
         <w:jc w:val="both"/>
       </w:pPr>
       <w:r>
-        <w:t>Проведенные вычислительные эксперименты доказали успешность примененных методов: разработанная модель успешно преодолела барьер стагнации, увеличив процент побед над агрессивным алгоритмом на 7% (до 58%), а также показала выдающуюся адаптивность против пассивных стратегий (до 80% побед).</w:t>
+        <w:t>Проведенные вычислительные эксперименты доказали успешность примененных методов: разработанная модель успешно преодолела барьер стагнации, увеличив процент побед над агрессивным алгоритмом на 7% (до 58%), а также показала выдающуюся адаптивность против пассивных стратегий</w:t>
+      </w:r>
+      <w:r>
+        <w:t xml:space="preserve">, увеличив процент побед на </w:t>
+      </w:r>
+      <w:r>
+        <w:t>8</w:t>
+      </w:r>
+      <w:r>
+        <w:t>%</w:t>
+      </w:r>
+      <w:r>
+        <w:t xml:space="preserve"> (до </w:t>
+      </w:r>
+      <w:r>
+        <w:t>7</w:t>
+      </w:r>
+      <w:r>
+        <w:t>3</w:t>
+      </w:r>
+      <w:r>
+        <w:t>% побед).</w:t>
       </w:r>
     </w:p>
     <w:p>
@@ -10009,7 +10137,7 @@
       <w:pPr>
         <w:pStyle w:val="1"/>
       </w:pPr>
-      <w:bookmarkStart w:id="25" w:name="_Toc227613269"/>
+      <w:bookmarkStart w:id="25" w:name="_Toc227663079"/>
       <w:r>
         <w:lastRenderedPageBreak/>
         <w:t xml:space="preserve">Список </w:t>
@@ -10393,7 +10521,7 @@
           <w:szCs w:val="24"/>
         </w:rPr>
       </w:pPr>
-      <w:bookmarkStart w:id="27" w:name="_Toc227613270"/>
+      <w:bookmarkStart w:id="27" w:name="_Toc227663080"/>
       <w:r>
         <w:lastRenderedPageBreak/>
         <w:t>Приложение А</w:t>
@@ -10458,7 +10586,7 @@
           <w:rStyle w:val="ab"/>
         </w:rPr>
       </w:pPr>
-      <w:hyperlink r:id="rId15" w:history="1">
+      <w:hyperlink r:id="rId19" w:history="1">
         <w:r>
           <w:rPr>
             <w:rStyle w:val="ab"/>
@@ -10699,7 +10827,7 @@
       </w:pPr>
     </w:p>
     <w:sectPr>
-      <w:footerReference w:type="default" r:id="rId16"/>
+      <w:footerReference w:type="default" r:id="rId20"/>
       <w:pgSz w:w="11906" w:h="16838"/>
       <w:pgMar w:top="1134" w:right="850" w:bottom="1134" w:left="1701" w:header="708" w:footer="708" w:gutter="0"/>
       <w:pgNumType w:start="0" w:chapStyle="2"/>

</xml_diff>